<commit_message>
Add LAF form profile data store
</commit_message>
<xml_diff>
--- a/templates/laf_poa/general.docx
+++ b/templates/laf_poa/general.docx
@@ -969,39 +969,8 @@
             <w:vAlign w:val="center"/>
           </w:tcPr>
           <w:p>
-            <w:pPr>
-              <w:pStyle w:val="TableParagraph"/>
-              <w:rPr>
-                <w:sz w:val="28"/>
-                <w:lang w:eastAsia="zh-TW"/>
-              </w:rPr>
-            </w:pPr>
-            <w:r>
-              <w:rPr>
-                <w:rFonts w:hint="eastAsia"/>
-                <w:sz w:val="28"/>
-                <w:lang w:eastAsia="zh-TW"/>
-              </w:rPr>
-              <w:t>970花蓮縣花蓮市明禮路18之6號1樓</w:t>
-            </w:r>
-          </w:p>
-          <w:p>
-            <w:pPr>
-              <w:spacing w:line="240" w:lineRule="atLeast"/>
-              <w:ind w:left="5"/>
-              <w:rPr>
-                <w:rFonts w:ascii="標楷體" w:eastAsia="標楷體" w:hAnsi="標楷體" w:cs="標楷體" w:hint="eastAsia"/>
-                <w:sz w:val="28"/>
-                <w:szCs w:val="22"/>
-              </w:rPr>
-            </w:pPr>
-            <w:r>
-              <w:rPr>
-                <w:rFonts w:ascii="標楷體" w:eastAsia="標楷體" w:hAnsi="標楷體" w:cs="標楷體" w:hint="eastAsia"/>
-                <w:sz w:val="28"/>
-                <w:szCs w:val="22"/>
-              </w:rPr>
-              <w:t>電話：03-835-7186</w:t>
+            <w:r>
+              <w:t>{{LAW_FIRM_ADDRESS_LINE}}　電話：{{LAW_FIRM_PHONE}}</w:t>
             </w:r>
           </w:p>
         </w:tc>
@@ -1087,21 +1056,8 @@
             <w:vAlign w:val="center"/>
           </w:tcPr>
           <w:p>
-            <w:pPr>
-              <w:pStyle w:val="TableParagraph"/>
-              <w:rPr>
-                <w:rFonts w:hint="eastAsia"/>
-                <w:sz w:val="28"/>
-                <w:lang w:eastAsia="zh-TW"/>
-              </w:rPr>
-            </w:pPr>
-            <w:r>
-              <w:rPr>
-                <w:rFonts w:hint="eastAsia"/>
-                <w:sz w:val="28"/>
-                <w:lang w:eastAsia="zh-TW"/>
-              </w:rPr>
-              <w:t>傳真：03-835-7135</w:t>
+            <w:r>
+              <w:t>傳真：{{LAW_FIRM_FAX}}</w:t>
             </w:r>
           </w:p>
         </w:tc>
@@ -1172,20 +1128,8 @@
             <w:vAlign w:val="center"/>
           </w:tcPr>
           <w:p>
-            <w:pPr>
-              <w:pStyle w:val="TableParagraph"/>
-              <w:rPr>
-                <w:sz w:val="28"/>
-                <w:lang w:eastAsia="zh-TW"/>
-              </w:rPr>
-            </w:pPr>
-            <w:r>
-              <w:rPr>
-                <w:rFonts w:hint="eastAsia"/>
-                <w:sz w:val="28"/>
-                <w:lang w:eastAsia="zh-TW"/>
-              </w:rPr>
-              <w:t>手機：0937-753-800</w:t>
+            <w:r>
+              <w:t>手機：{{LAW_FIRM_MOBILE}}</w:t>
             </w:r>
           </w:p>
         </w:tc>

</xml_diff>